<commit_message>
add new CE methods, using cursor generate sionna like channel
fm continues transmit, new CE metods, train CE model
</commit_message>
<xml_diff>
--- a/Clink 256Trx.docx
+++ b/Clink 256Trx.docx
@@ -23,6 +23,9 @@
     </w:p>
     <w:p>
       <w:r>
+        <w:rPr>
+          <w:noProof/>
+        </w:rPr>
         <w:drawing>
           <wp:inline distT="0" distB="0" distL="0" distR="0" wp14:anchorId="6F40F00B" wp14:editId="1C80E4A4">
             <wp:extent cx="5013960" cy="3097299"/>
@@ -67,6 +70,9 @@
     </w:p>
     <w:p>
       <w:r>
+        <w:rPr>
+          <w:noProof/>
+        </w:rPr>
         <w:drawing>
           <wp:inline distT="0" distB="0" distL="0" distR="0" wp14:anchorId="4E42E09E" wp14:editId="61816641">
             <wp:extent cx="4869180" cy="2995898"/>
@@ -105,6 +111,251 @@
       </w:r>
     </w:p>
     <w:p/>
+    <w:p>
+      <w:r>
+        <w:lastRenderedPageBreak/>
+        <w:t>DNN first try</w:t>
+      </w:r>
+    </w:p>
+    <w:p>
+      <w:r>
+        <w:rPr>
+          <w:noProof/>
+        </w:rPr>
+        <w:drawing>
+          <wp:inline distT="0" distB="0" distL="0" distR="0" wp14:anchorId="76FB6478" wp14:editId="175644F8">
+            <wp:extent cx="5943600" cy="3684270"/>
+            <wp:effectExtent l="0" t="0" r="0" b="0"/>
+            <wp:docPr id="757048452" name="Picture 1"/>
+            <wp:cNvGraphicFramePr>
+              <a:graphicFrameLocks xmlns:a="http://schemas.openxmlformats.org/drawingml/2006/main" noChangeAspect="1"/>
+            </wp:cNvGraphicFramePr>
+            <a:graphic xmlns:a="http://schemas.openxmlformats.org/drawingml/2006/main">
+              <a:graphicData uri="http://schemas.openxmlformats.org/drawingml/2006/picture">
+                <pic:pic xmlns:pic="http://schemas.openxmlformats.org/drawingml/2006/picture">
+                  <pic:nvPicPr>
+                    <pic:cNvPr id="757048452" name=""/>
+                    <pic:cNvPicPr/>
+                  </pic:nvPicPr>
+                  <pic:blipFill>
+                    <a:blip r:embed="rId6"/>
+                    <a:stretch>
+                      <a:fillRect/>
+                    </a:stretch>
+                  </pic:blipFill>
+                  <pic:spPr>
+                    <a:xfrm>
+                      <a:off x="0" y="0"/>
+                      <a:ext cx="5943600" cy="3684270"/>
+                    </a:xfrm>
+                    <a:prstGeom prst="rect">
+                      <a:avLst/>
+                    </a:prstGeom>
+                  </pic:spPr>
+                </pic:pic>
+              </a:graphicData>
+            </a:graphic>
+          </wp:inline>
+        </w:drawing>
+      </w:r>
+    </w:p>
+    <w:p>
+      <w:r>
+        <w:t>Opus 4.6 DNN _add_AWGN instead of LS + wind + int</w:t>
+      </w:r>
+      <w:r>
+        <w:t xml:space="preserve"> 32+12</w:t>
+      </w:r>
+    </w:p>
+    <w:p>
+      <w:r>
+        <w:drawing>
+          <wp:inline distT="0" distB="0" distL="0" distR="0" wp14:anchorId="629BEEA7" wp14:editId="485E206A">
+            <wp:extent cx="5943600" cy="2082165"/>
+            <wp:effectExtent l="0" t="0" r="0" b="0"/>
+            <wp:docPr id="1833932620" name="Picture 1"/>
+            <wp:cNvGraphicFramePr>
+              <a:graphicFrameLocks xmlns:a="http://schemas.openxmlformats.org/drawingml/2006/main" noChangeAspect="1"/>
+            </wp:cNvGraphicFramePr>
+            <a:graphic xmlns:a="http://schemas.openxmlformats.org/drawingml/2006/main">
+              <a:graphicData uri="http://schemas.openxmlformats.org/drawingml/2006/picture">
+                <pic:pic xmlns:pic="http://schemas.openxmlformats.org/drawingml/2006/picture">
+                  <pic:nvPicPr>
+                    <pic:cNvPr id="1833932620" name=""/>
+                    <pic:cNvPicPr/>
+                  </pic:nvPicPr>
+                  <pic:blipFill>
+                    <a:blip r:embed="rId7"/>
+                    <a:stretch>
+                      <a:fillRect/>
+                    </a:stretch>
+                  </pic:blipFill>
+                  <pic:spPr>
+                    <a:xfrm>
+                      <a:off x="0" y="0"/>
+                      <a:ext cx="5943600" cy="2082165"/>
+                    </a:xfrm>
+                    <a:prstGeom prst="rect">
+                      <a:avLst/>
+                    </a:prstGeom>
+                  </pic:spPr>
+                </pic:pic>
+              </a:graphicData>
+            </a:graphic>
+          </wp:inline>
+        </w:drawing>
+      </w:r>
+    </w:p>
+    <w:p>
+      <w:r>
+        <w:br w:type="page"/>
+      </w:r>
+    </w:p>
+    <w:p>
+      <w:r>
+        <w:lastRenderedPageBreak/>
+        <w:t>12+4</w:t>
+      </w:r>
+    </w:p>
+    <w:p>
+      <w:r>
+        <w:drawing>
+          <wp:inline distT="0" distB="0" distL="0" distR="0" wp14:anchorId="6003E1E9" wp14:editId="15972F37">
+            <wp:extent cx="5943600" cy="2080895"/>
+            <wp:effectExtent l="0" t="0" r="0" b="0"/>
+            <wp:docPr id="709356000" name="Picture 1"/>
+            <wp:cNvGraphicFramePr>
+              <a:graphicFrameLocks xmlns:a="http://schemas.openxmlformats.org/drawingml/2006/main" noChangeAspect="1"/>
+            </wp:cNvGraphicFramePr>
+            <a:graphic xmlns:a="http://schemas.openxmlformats.org/drawingml/2006/main">
+              <a:graphicData uri="http://schemas.openxmlformats.org/drawingml/2006/picture">
+                <pic:pic xmlns:pic="http://schemas.openxmlformats.org/drawingml/2006/picture">
+                  <pic:nvPicPr>
+                    <pic:cNvPr id="709356000" name=""/>
+                    <pic:cNvPicPr/>
+                  </pic:nvPicPr>
+                  <pic:blipFill>
+                    <a:blip r:embed="rId8"/>
+                    <a:stretch>
+                      <a:fillRect/>
+                    </a:stretch>
+                  </pic:blipFill>
+                  <pic:spPr>
+                    <a:xfrm>
+                      <a:off x="0" y="0"/>
+                      <a:ext cx="5943600" cy="2080895"/>
+                    </a:xfrm>
+                    <a:prstGeom prst="rect">
+                      <a:avLst/>
+                    </a:prstGeom>
+                  </pic:spPr>
+                </pic:pic>
+              </a:graphicData>
+            </a:graphic>
+          </wp:inline>
+        </w:drawing>
+      </w:r>
+    </w:p>
+    <w:p>
+      <w:r>
+        <w:t>1+1 (baseline RCE here also use 1+1)</w:t>
+      </w:r>
+    </w:p>
+    <w:p>
+      <w:r>
+        <w:drawing>
+          <wp:inline distT="0" distB="0" distL="0" distR="0" wp14:anchorId="407F196E" wp14:editId="6204EFB1">
+            <wp:extent cx="5943600" cy="2035175"/>
+            <wp:effectExtent l="0" t="0" r="0" b="3175"/>
+            <wp:docPr id="97144094" name="Picture 1"/>
+            <wp:cNvGraphicFramePr>
+              <a:graphicFrameLocks xmlns:a="http://schemas.openxmlformats.org/drawingml/2006/main" noChangeAspect="1"/>
+            </wp:cNvGraphicFramePr>
+            <a:graphic xmlns:a="http://schemas.openxmlformats.org/drawingml/2006/main">
+              <a:graphicData uri="http://schemas.openxmlformats.org/drawingml/2006/picture">
+                <pic:pic xmlns:pic="http://schemas.openxmlformats.org/drawingml/2006/picture">
+                  <pic:nvPicPr>
+                    <pic:cNvPr id="97144094" name=""/>
+                    <pic:cNvPicPr/>
+                  </pic:nvPicPr>
+                  <pic:blipFill>
+                    <a:blip r:embed="rId9"/>
+                    <a:stretch>
+                      <a:fillRect/>
+                    </a:stretch>
+                  </pic:blipFill>
+                  <pic:spPr>
+                    <a:xfrm>
+                      <a:off x="0" y="0"/>
+                      <a:ext cx="5943600" cy="2035175"/>
+                    </a:xfrm>
+                    <a:prstGeom prst="rect">
+                      <a:avLst/>
+                    </a:prstGeom>
+                  </pic:spPr>
+                </pic:pic>
+              </a:graphicData>
+            </a:graphic>
+          </wp:inline>
+        </w:drawing>
+      </w:r>
+    </w:p>
+    <w:p/>
+    <w:p>
+      <w:r>
+        <w:br w:type="page"/>
+      </w:r>
+    </w:p>
+    <w:p>
+      <w:r>
+        <w:lastRenderedPageBreak/>
+        <w:t>DNN try on SDR dump 2Rx1Tx QAM256 test cross room comm</w:t>
+      </w:r>
+    </w:p>
+    <w:p>
+      <w:r>
+        <w:t>First try</w:t>
+      </w:r>
+    </w:p>
+    <w:p>
+      <w:r>
+        <w:drawing>
+          <wp:inline distT="0" distB="0" distL="0" distR="0" wp14:anchorId="43D58126" wp14:editId="70C86724">
+            <wp:extent cx="4168501" cy="3010161"/>
+            <wp:effectExtent l="0" t="0" r="3810" b="0"/>
+            <wp:docPr id="1090240597" name="Picture 1"/>
+            <wp:cNvGraphicFramePr>
+              <a:graphicFrameLocks xmlns:a="http://schemas.openxmlformats.org/drawingml/2006/main" noChangeAspect="1"/>
+            </wp:cNvGraphicFramePr>
+            <a:graphic xmlns:a="http://schemas.openxmlformats.org/drawingml/2006/main">
+              <a:graphicData uri="http://schemas.openxmlformats.org/drawingml/2006/picture">
+                <pic:pic xmlns:pic="http://schemas.openxmlformats.org/drawingml/2006/picture">
+                  <pic:nvPicPr>
+                    <pic:cNvPr id="1090240597" name=""/>
+                    <pic:cNvPicPr/>
+                  </pic:nvPicPr>
+                  <pic:blipFill>
+                    <a:blip r:embed="rId10"/>
+                    <a:stretch>
+                      <a:fillRect/>
+                    </a:stretch>
+                  </pic:blipFill>
+                  <pic:spPr>
+                    <a:xfrm>
+                      <a:off x="0" y="0"/>
+                      <a:ext cx="4168501" cy="3010161"/>
+                    </a:xfrm>
+                    <a:prstGeom prst="rect">
+                      <a:avLst/>
+                    </a:prstGeom>
+                  </pic:spPr>
+                </pic:pic>
+              </a:graphicData>
+            </a:graphic>
+          </wp:inline>
+        </w:drawing>
+      </w:r>
+    </w:p>
     <w:p/>
     <w:sectPr>
       <w:pgSz w:w="12240" w:h="15840"/>

</xml_diff>